<commit_message>
feat: add destroy complete evidence and update PDF/DOCX report
</commit_message>
<xml_diff>
--- a/Informe_Evaluacion_IaC_Villarroel_Galdamez_Ev2.docx
+++ b/Informe_Evaluacion_IaC_Villarroel_Galdamez_Ev2.docx
@@ -1601,9 +1601,64 @@
           <w:rFonts w:ascii="Arial" w:hAnsi="Arial"/>
           <w:sz w:val="22"/>
         </w:rPr>
-        <w:t>Como buena práctica de gobernanza y preservación presupuestaria en AWS Academy Learner Lab, se ejecutó la destrucción completa de la infraestructura mediante terraform destroy -var-file=dev.tfvars -auto-approve. Todos los recursos fueron eliminados ordenadamente, eliminando costos residuales.</w:t>
+        <w:t>Como buena práctica de gobernanza y preservación presupuestaria en AWS Academy Learner Lab, se ejecutó la destrucción completa de la infraestructura mediante terraform destroy -var-file=dev.tfvars -auto-approve. Todos los 39 recursos fueron eliminados ordenadamente, culminando exitosamente con el mensaje 'Destroy complete! Resources: 39 destroyed'.</w:t>
       </w:r>
     </w:p>
+    <w:p/>
+    <w:p>
+      <w:pPr>
+        <w:jc w:val="center"/>
+      </w:pPr>
+      <w:r>
+        <w:drawing>
+          <wp:inline xmlns:a="http://schemas.openxmlformats.org/drawingml/2006/main" xmlns:pic="http://schemas.openxmlformats.org/drawingml/2006/picture">
+            <wp:extent cx="5486400" cy="2925366"/>
+            <wp:docPr id="11" name="Picture 11"/>
+            <wp:cNvGraphicFramePr>
+              <a:graphicFrameLocks noChangeAspect="1"/>
+            </wp:cNvGraphicFramePr>
+            <a:graphic>
+              <a:graphicData uri="http://schemas.openxmlformats.org/drawingml/2006/picture">
+                <pic:pic>
+                  <pic:nvPicPr>
+                    <pic:cNvPr id="0" name="11_destroy_complete.png"/>
+                    <pic:cNvPicPr/>
+                  </pic:nvPicPr>
+                  <pic:blipFill>
+                    <a:blip r:embed="rId19"/>
+                    <a:stretch>
+                      <a:fillRect/>
+                    </a:stretch>
+                  </pic:blipFill>
+                  <pic:spPr>
+                    <a:xfrm>
+                      <a:off x="0" y="0"/>
+                      <a:ext cx="5486400" cy="2925366"/>
+                    </a:xfrm>
+                    <a:prstGeom prst="rect"/>
+                  </pic:spPr>
+                </pic:pic>
+              </a:graphicData>
+            </a:graphic>
+          </wp:inline>
+        </w:drawing>
+      </w:r>
+    </w:p>
+    <w:p>
+      <w:pPr>
+        <w:jc w:val="center"/>
+      </w:pPr>
+      <w:r>
+        <w:rPr>
+          <w:rFonts w:ascii="Arial" w:hAnsi="Arial"/>
+          <w:i/>
+          <w:color w:val="64748B"/>
+          <w:sz w:val="18"/>
+        </w:rPr>
+        <w:t>Figura: Cierre del ciclo de vida: terraform destroy finalizado exitosamente (Destroy complete!)</w:t>
+      </w:r>
+    </w:p>
+    <w:p/>
     <w:p>
       <w:pPr>
         <w:pStyle w:val="Heading1"/>

</xml_diff>